<commit_message>
Refine statute citations in the Gangneung letter after verification
- Cite 제20조 제2항 제1호 (not 단서) as the 수의 method basis, matching the
  cross-reference used by 시행령 제13조
- Cite 제21조 제2항 for renewal of a 수의 permit and 제21조 제5항 for the
  one-month filing deadline; cite 시행령 제13조 제3항 at paragraph level
- Add the 실시협약 date (2021. 7. 30.) from the in-house legal opinion
- Update the review memo with the verification trail, the no-limit renewal
  point under 제21조 제2항, and the 제21조 제1항 단서 free-use-period angle

Co-Authored-By: Claude Fable 5.1 <noreply@anthropic.com>
Claude-Session: https://claude.ai/code/session_01VWRVXZMiWjNZsjYiS96kbg
</commit_message>
<xml_diff>
--- a/documents/gangneung/DS-20260917-001_아르떼뮤지엄강릉_사용허가갱신_의사통지_공문.docx
+++ b/documents/gangneung/DS-20260917-001_아르떼뮤지엄강릉_사용허가갱신_의사통지_공문.docx
@@ -429,7 +429,7 @@
           <w:sz w:val="22"/>
           <w:szCs w:val="22"/>
         </w:rPr>
-        <w:t xml:space="preserve">가. 「강릉 미디어아트 전시관(아르떼뮤지엄 강릉) 건립·운영에 따른 실시협약서」(강릉시–주식회사 디스트릭트코리아) 및 2023. 6. 20.자 변경합의서</w:t>
+        <w:t xml:space="preserve">가. 「강릉 미디어아트 전시관(아르떼뮤지엄 강릉) 건립·운영에 따른 실시협약서」(2021. 7. 30., 강릉시–주식회사 디스트릭트코리아) 및 2023. 6. 20.자 변경합의서</w:t>
       </w:r>
     </w:p>
     <w:p>
@@ -457,7 +457,7 @@
           <w:sz w:val="22"/>
           <w:szCs w:val="22"/>
         </w:rPr>
-        <w:t xml:space="preserve">다. 「공유재산 및 물품 관리법」 제7조 제2항 제1호, 제20조 제2항, 제21조 및 같은 법 시행령 제13조</w:t>
+        <w:t xml:space="preserve">다. 「공유재산 및 물품 관리법」 제7조 제2항 제1호, 제20조 제2항 제1호, 제21조 제2항·제5항 및 같은 법 시행령 제13조 제3항</w:t>
       </w:r>
     </w:p>
     <w:p>
@@ -485,7 +485,7 @@
           <w:sz w:val="22"/>
           <w:szCs w:val="22"/>
         </w:rPr>
-        <w:t xml:space="preserve">가. (연장 의사) 당사는 현행 사용허가기간이 만료된 이후에도 「아르떼뮤지엄 강릉」을 중단 없이 계속 운영하고자 하며, 이를 위하여 「공유재산 및 물품 관리법」 제21조에 따라 5년의 범위에서 종전 사용허가의 갱신을 신청할 예정입니다. 이는 당사 대표이사를 포함한 경영진의 확정된 입장임을 알려드립니다.</w:t>
+        <w:t xml:space="preserve">가. (연장 의사) 당사는 현행 사용허가기간이 만료된 이후에도 「아르떼뮤지엄 강릉」을 중단 없이 계속 운영하고자 하며, 이를 위하여 「공유재산 및 물품 관리법」 제21조 제2항에 따라 5년의 범위에서 종전 사용허가의 갱신을 신청할 예정입니다. 이는 당사 대표이사를 포함한 경영진의 확정된 입장임을 알려드립니다.</w:t>
       </w:r>
     </w:p>
     <w:p>
@@ -499,7 +499,7 @@
           <w:sz w:val="22"/>
           <w:szCs w:val="22"/>
         </w:rPr>
-        <w:t xml:space="preserve">나. (갱신 방법) 당사는 위 법 제7조 제2항 제1호에 따른 기부자로서, 같은 법 제20조 제2항 단서 및 같은 법 시행령 제13조에 따라 수의의 방법에 의한 사용허가 갱신 대상에 해당하는 것으로 이해하고 있습니다. 이에 본 시설의 운영에 공백이 발생하지 않도록 수의의 방법에 의한 갱신 절차를 진행하여 주시기를 요청드리며, 당사는 사용허가기간 만료 1개월 전까지 신청하도록 정한 법정 기한에 앞서 귀 시가 안내하는 일정과 서식에 따라 갱신 신청서 및 관련 서류를 제출하겠습니다.</w:t>
+        <w:t xml:space="preserve">나. (갱신 방법) 당사는 위 법 제7조 제2항 제1호에 따른 기부자로서 같은 법 제20조 제2항 제1호 및 같은 법 시행령 제13조 제3항에 따라 수의의 방법으로 사용허가를 받은 자이므로, 같은 법 제21조 제2항에 따른 종전 사용허가의 갱신 대상에 해당하는 것으로 이해하고 있습니다. 이에 본 시설의 운영에 공백이 발생하지 않도록 갱신 절차를 진행하여 주시기를 요청드리며, 당사는 같은 법 제21조 제5항이 정한 신청 기한(사용허가기간 만료 1개월 전)에 앞서 귀 시가 안내하는 일정과 서식에 따라 갱신 신청서 및 관련 서류를 제출하겠습니다.</w:t>
       </w:r>
     </w:p>
     <w:p>

</xml_diff>